<commit_message>
Finalize Hickory lease draft with deal terms
Landlord Burns Commercial Properties (third-party, arm's-length); Premises 1,607
sq ft at 13387 US Highway 69 North, Tyler TX 75706; Initial term 6/1/2026-
5/31/2028 (2 yr); Base Rent $2,100/mo fixed; deposit $2,100. Renewal-option
count/length left blank with an SBA note (lender wants term incl. options to meet
the loan term). Remaining fill-ins: landlord address + signatory.

https://claude.ai/code/session_01GAHLyfqLR9bxwN2jm6VjPU
</commit_message>
<xml_diff>
--- a/sba_application/10_supporting_documents/office_lease/Hickory_Hospice_Commercial_Lease_DRAFT.docx
+++ b/sba_application/10_supporting_documents/office_lease/Hickory_Hospice_Commercial_Lease_DRAFT.docx
@@ -34,7 +34,7 @@
           <w:color w:val="606060"/>
           <w:sz w:val="17"/>
         </w:rPr>
-        <w:t>DRAFT for review and execution by the parties and their counsel. Bracketed/underlined items must be completed. This template is not legal advice; have Texas counsel review before signing. The renewal structure below is set so the lease term equals or exceeds the SBA 7(a) loan term, as the lender requires.</w:t>
+        <w:t>DRAFT for review and execution by the parties and their counsel. Remaining underlined items must be completed. This template is not legal advice; have Texas counsel review before signing.</w:t>
       </w:r>
     </w:p>
     <w:p>
@@ -53,7 +53,7 @@
           <w:i w:val="0"/>
           <w:sz w:val="21"/>
         </w:rPr>
-        <w:t>This Commercial Lease Agreement (this “Lease”) is entered into and effective as of ________________, 20__ (the “Effective Date”), by and between:</w:t>
+        <w:t>This Commercial Lease Agreement (this “Lease”) is entered into and effective as of June 1, 2026 (the “Effective Date”), by and between:</w:t>
       </w:r>
     </w:p>
     <w:p>
@@ -63,7 +63,7 @@
           <w:i w:val="0"/>
           <w:sz w:val="21"/>
         </w:rPr>
-        <w:t>LANDLORD:  ________________ (“Landlord”), whose address is ________________; and</w:t>
+        <w:t>LANDLORD:  Burns Commercial Properties (“Landlord”), whose address is ________________; and</w:t>
       </w:r>
     </w:p>
     <w:p>
@@ -118,7 +118,7 @@
                 <w:b/>
                 <w:sz w:val="19"/>
               </w:rPr>
-              <w:t>Premises (the “Premises”)</w:t>
+              <w:t>Premises</w:t>
             </w:r>
           </w:p>
         </w:tc>
@@ -132,7 +132,7 @@
               <w:rPr>
                 <w:sz w:val="19"/>
               </w:rPr>
-              <w:t>13387 US Highway 69 North, Tyler, Texas 75706, United States, consisting of approximately ________________ rentable square feet (Suite ________________), together with the common areas.</w:t>
+              <w:t>13387 US Highway 69 North, Tyler, Texas 75706, United States, consisting of approximately 1,607 rentable square feet, together with the right to use the common areas and parking.</w:t>
             </w:r>
           </w:p>
         </w:tc>
@@ -194,7 +194,7 @@
               <w:rPr>
                 <w:sz w:val="19"/>
               </w:rPr>
-              <w:t>Five (5) years, commencing on ________________, 20__ (the “Commencement Date”) and ending on ________________, 20__, unless sooner terminated under this Lease.</w:t>
+              <w:t>Two (2) years, commencing June 1, 2026 (the “Commencement Date”) and ending May 31, 2028, unless sooner terminated under this Lease.</w:t>
             </w:r>
           </w:p>
         </w:tc>
@@ -225,7 +225,7 @@
               <w:rPr>
                 <w:sz w:val="19"/>
               </w:rPr>
-              <w:t>One (1) option to renew for an additional five (5) years on the same terms (except Base Rent, which may be adjusted per Section 4), so that the total available term meets or exceeds the term of Tenant’s SBA 7(a) loan. Tenant exercises by written notice at least ninety (90) days before expiration.</w:t>
+              <w:t>Tenant shall have ________________ option(s) to renew for additional periods of ________________ year(s) each on the same terms (Base Rent fixed unless the Parties agree otherwise in writing), exercisable by written notice at least ninety (90) days before expiration. [See SBA note below.]</w:t>
             </w:r>
           </w:p>
         </w:tc>
@@ -256,38 +256,7 @@
               <w:rPr>
                 <w:sz w:val="19"/>
               </w:rPr>
-              <w:t>$2,100.00 per month ($25,200.00 per year), due in advance on the first day of each month.</w:t>
-            </w:r>
-          </w:p>
-        </w:tc>
-      </w:tr>
-      <w:tr>
-        <w:tc>
-          <w:tcPr>
-            <w:tcW w:type="dxa" w:w="2736"/>
-          </w:tcPr>
-          <w:p>
-            <w:r/>
-            <w:r>
-              <w:rPr>
-                <w:b/>
-                <w:sz w:val="19"/>
-              </w:rPr>
-              <w:t>Rent Adjustment</w:t>
-            </w:r>
-          </w:p>
-        </w:tc>
-        <w:tc>
-          <w:tcPr>
-            <w:tcW w:type="dxa" w:w="6912"/>
-          </w:tcPr>
-          <w:p>
-            <w:r/>
-            <w:r>
-              <w:rPr>
-                <w:sz w:val="19"/>
-              </w:rPr>
-              <w:t>[Optional] On each anniversary of the Commencement Date, Base Rent [shall remain fixed] / [shall increase by ____% or by CPI]. Select one and delete the other.</w:t>
+              <w:t>$2,100.00 per month ($25,200.00 per year), fixed for the Term; due in advance on the first day of each month.</w:t>
             </w:r>
           </w:p>
         </w:tc>
@@ -318,7 +287,7 @@
               <w:rPr>
                 <w:sz w:val="19"/>
               </w:rPr>
-              <w:t>$________________ (suggested: one (1) month’s Base Rent = $2,100.00), due at signing.</w:t>
+              <w:t>$2,100.00 (one month’s Base Rent), due at signing.</w:t>
             </w:r>
           </w:p>
         </w:tc>
@@ -358,6 +327,16 @@
     <w:p>
       <w:r>
         <w:rPr>
+          <w:i/>
+          <w:color w:val="606060"/>
+          <w:sz w:val="17"/>
+        </w:rPr>
+        <w:t>SBA note on term: the SBA 7(a) lender generally requires the lease term, including renewal options, to meet or exceed the loan term (~10 years). A two-year initial term satisfies this only if enough renewal options are added to reach that length — fill in the option count/length above, or confirm a longer term with Landlord, before submitting to the lender.</w:t>
+      </w:r>
+    </w:p>
+    <w:p>
+      <w:r>
+        <w:rPr>
           <w:b/>
           <w:color w:val="1F3864"/>
           <w:sz w:val="22"/>
@@ -372,7 +351,7 @@
           <w:i w:val="0"/>
           <w:sz w:val="21"/>
         </w:rPr>
-        <w:t>Landlord leases to Tenant, and Tenant leases from Landlord, the Premises described above, together with the non-exclusive right to use the parking and common areas serving the building, subject to the terms of this Lease. Tenant accepts the Premises in “AS-IS” condition except for any landlord work listed on Exhibit A (________________).</w:t>
+        <w:t>Landlord leases to Tenant, and Tenant leases from Landlord, the Premises described above (approximately 1,607 rentable square feet), together with the non-exclusive right to use the parking and common areas serving the building. Tenant accepts the Premises in “AS-IS” condition except for any landlord work listed on Exhibit A (________________).</w:t>
       </w:r>
     </w:p>
     <w:p>
@@ -392,7 +371,7 @@
           <w:i w:val="0"/>
           <w:sz w:val="21"/>
         </w:rPr>
-        <w:t>The Initial Term and any exercised Renewal Term are the “Term.” If Landlord cannot deliver possession by the Commencement Date, Rent abates until delivery, and that is Tenant’s sole remedy for delay. Upon request, the Parties will confirm the Commencement and expiration dates in a short written memorandum.</w:t>
+        <w:t>The Initial Term (June 1, 2026 – May 31, 2028) and any exercised Renewal Term are the “Term.” If Landlord cannot deliver possession by the Commencement Date, Rent abates until delivery, and that is Tenant’s sole remedy for delay.</w:t>
       </w:r>
     </w:p>
     <w:p>
@@ -412,7 +391,7 @@
           <w:i w:val="0"/>
           <w:sz w:val="21"/>
         </w:rPr>
-        <w:t>Tenant shall pay Base Rent of $2,100.00 per month, in advance, on or before the first day of each calendar month, without demand, deduction, or offset, at Landlord’s address or as Landlord directs. Rent for any partial month is prorated. Any payment more than five (5) days late incurs a late charge of five percent (5%) of the overdue amount, plus interest at the lesser of eighteen percent (18%) per annum or the maximum lawful rate. Upon renewal, Base Rent is as set in Section 1 (Rent Adjustment).</w:t>
+        <w:t>Tenant shall pay Base Rent of $2,100.00 per month, fixed for the Term, in advance, on or before the first day of each calendar month, without demand, deduction, or offset, at Landlord’s address or as Landlord directs. Rent for any partial month is prorated. Any payment more than five (5) days late incurs a late charge of five percent (5%) of the overdue amount, plus interest at the lesser of eighteen percent (18%) per annum or the maximum lawful rate.</w:t>
       </w:r>
     </w:p>
     <w:p>
@@ -432,7 +411,7 @@
           <w:i w:val="0"/>
           <w:sz w:val="21"/>
         </w:rPr>
-        <w:t>At signing, Tenant shall deposit the Security Deposit stated in Section 1 as security for performance. Landlord may apply it to cure defaults or repair damage beyond normal wear; Tenant shall replenish any amount so applied within ten (10) days of notice. Landlord returns the balance, less lawful deductions, within thirty (30) days after the Term ends and Tenant surrenders the Premises.</w:t>
+        <w:t>At signing, Tenant shall deposit $2,100.00 as security for performance. Landlord may apply it to cure defaults or repair damage beyond normal wear; Tenant shall replenish any amount so applied within ten (10) days of notice. Landlord returns the balance, less lawful deductions, within thirty (30) days after the Term ends and Tenant surrenders the Premises.</w:t>
       </w:r>
     </w:p>
     <w:p>
@@ -452,7 +431,7 @@
           <w:i w:val="0"/>
           <w:sz w:val="21"/>
         </w:rPr>
-        <w:t>Tenant shall use the Premises only for the Permitted Use and shall comply, at its expense, with all applicable laws, ordinances, and regulations, including the Americans with Disabilities Act, the Health Insurance Portability and Accountability Act (HIPAA), Texas Health and Human Services Commission licensure requirements, and Medicare Conditions of Participation. Tenant shall not create a nuisance, commit waste, or use the Premises for any unlawful purpose.</w:t>
+        <w:t>Tenant shall use the Premises only for the Permitted Use and shall comply, at its expense, with all applicable laws, including the Americans with Disabilities Act, HIPAA, Texas Health and Human Services Commission licensure requirements, and Medicare Conditions of Participation. Tenant shall not create a nuisance, commit waste, or use the Premises unlawfully.</w:t>
       </w:r>
     </w:p>
     <w:p>
@@ -492,7 +471,7 @@
           <w:i w:val="0"/>
           <w:sz w:val="21"/>
         </w:rPr>
-        <w:t>Landlord shall maintain the foundation, exterior walls, roof, structural components, and common areas in good repair. Tenant shall, at its expense, keep the interior of the Premises (including fixtures, finishes, and any HVAC exclusively serving the Premises) clean and in good repair, and surrender the Premises in good condition, ordinary wear and tear and casualty excepted.</w:t>
+        <w:t>Landlord shall maintain the foundation, exterior walls, roof, structural components, and common areas in good repair. Tenant shall, at its expense, keep the interior of the Premises (including fixtures, finishes, and any HVAC exclusively serving the Premises) in good repair, and surrender the Premises in good condition, ordinary wear and tear and casualty excepted.</w:t>
       </w:r>
     </w:p>
     <w:p>
@@ -512,7 +491,7 @@
           <w:i w:val="0"/>
           <w:sz w:val="21"/>
         </w:rPr>
-        <w:t>Tenant shall not make structural alterations without Landlord’s prior written consent (not to be unreasonably withheld). Non-structural, cosmetic improvements may be made without consent. Permitted alterations become Landlord’s property at the end of the Term unless the Parties agree otherwise in writing. Tenant’s trade fixtures and equipment remain Tenant’s property.</w:t>
+        <w:t>Tenant shall not make structural alterations without Landlord’s prior written consent (not unreasonably withheld). Non-structural, cosmetic improvements may be made without consent. Permitted alterations become Landlord’s property at the end of the Term unless agreed otherwise in writing; Tenant’s trade fixtures and equipment remain Tenant’s property.</w:t>
       </w:r>
     </w:p>
     <w:p>
@@ -532,7 +511,7 @@
           <w:i w:val="0"/>
           <w:sz w:val="21"/>
         </w:rPr>
-        <w:t>Tenant shall maintain, at its expense: (a) commercial general liability insurance of not less than $1,000,000 per occurrence / $2,000,000 aggregate, naming Landlord (and Landlord’s lender, if any) as additional insured; and (b) property insurance on Tenant’s personal property and improvements. Landlord shall maintain property insurance on the building. Each Party waives subrogation against the other to the extent of insurance proceeds. Tenant shall provide certificates of insurance on request.</w:t>
+        <w:t>Tenant shall maintain (a) commercial general liability insurance of not less than $1,000,000 per occurrence / $2,000,000 aggregate, naming Landlord (and Landlord’s lender, if any) as additional insured; and (b) property insurance on Tenant’s personal property and improvements. Landlord shall maintain property insurance on the building. Each Party waives subrogation against the other to the extent of insurance proceeds. Tenant shall provide certificates of insurance on request.</w:t>
       </w:r>
     </w:p>
     <w:p>
@@ -572,7 +551,7 @@
           <w:i w:val="0"/>
           <w:sz w:val="21"/>
         </w:rPr>
-        <w:t>Tenant shall not assign this Lease or sublet the Premises without Landlord’s prior written consent, not to be unreasonably withheld. Notwithstanding the foregoing, Landlord acknowledges that Tenant’s business is financed in part by a U.S. Small Business Administration (SBA) 7(a) loan, and Landlord agrees, upon request and at no cost to Landlord, to execute a commercially reasonable Landlord’s Waiver / Subordination and a Consent to Collateral Assignment of this Lease in favor of Tenant’s SBA lender, and to provide the lender notice and a reasonable opportunity to cure any Tenant default before termination. The Term (including options) is intended to meet or exceed the term of the SBA loan.</w:t>
+        <w:t>Tenant shall not assign this Lease or sublet the Premises without Landlord’s prior written consent, not unreasonably withheld. Landlord acknowledges that Tenant’s business is financed in part by a U.S. Small Business Administration (SBA) 7(a) loan, and agrees, upon request and at no cost to Landlord, to execute a commercially reasonable Landlord’s Waiver / Subordination and a Consent to Collateral Assignment of this Lease in favor of Tenant’s SBA lender, and to provide the lender notice and a reasonable opportunity to cure any Tenant default before termination.</w:t>
       </w:r>
     </w:p>
     <w:p>
@@ -592,7 +571,7 @@
           <w:i w:val="0"/>
           <w:sz w:val="21"/>
         </w:rPr>
-        <w:t>Tenant is in default if it (a) fails to pay Rent within five (5) days after written notice, or (b) fails to perform any other obligation within twenty (20) days after written notice (or such longer period as is reasonably needed if Tenant promptly begins and diligently pursues cure). On default, Landlord may pursue all remedies at law or equity, including termination and recovery of possession and damages, subject to Landlord’s duty to mitigate as required by Texas law. The SBA lender’s cure rights in Section 12 survive.</w:t>
+        <w:t>Tenant is in default if it (a) fails to pay Rent within five (5) days after written notice, or (b) fails to perform any other obligation within twenty (20) days after written notice (or such longer period as is reasonably needed if Tenant promptly begins and diligently pursues cure). On default, Landlord may pursue all remedies at law or equity, subject to Landlord’s duty to mitigate as required by Texas law. The SBA lender’s cure rights in Section 12 survive.</w:t>
       </w:r>
     </w:p>
     <w:p>
@@ -672,7 +651,7 @@
           <w:i w:val="0"/>
           <w:sz w:val="21"/>
         </w:rPr>
-        <w:t>Notices must be in writing and delivered personally, by certified mail (return receipt), or by recognized overnight courier to: Landlord at ________________; and Tenant at 13387 US Highway 69 North, Tyler, Texas 75706, Attn: Manager, with a copy to ________________.</w:t>
+        <w:t>Notices must be in writing and delivered personally, by certified mail (return receipt), or by recognized overnight courier to: Landlord, Burns Commercial Properties, at ________________; and Tenant at 13387 US Highway 69 North, Tyler, Texas 75706, Attn: Manager.</w:t>
       </w:r>
     </w:p>
     <w:p>
@@ -708,21 +687,11 @@
     <w:p>
       <w:r>
         <w:rPr>
-          <w:i/>
-          <w:color w:val="606060"/>
-          <w:sz w:val="17"/>
-        </w:rPr>
-        <w:t>If Landlord is owned or controlled, in whole or in part, by Tenant, by Tenant’s owners, or by an affiliate (e.g., Geoff Schackmann, Adeline &amp; Lilah, LLC, or Tyler Hospice Hold LLC), this is a related-party lease and must be disclosed to the SBA lender, supported by a market-rate (arm’s-length) rent justification. Complete the line below.</w:t>
-      </w:r>
-    </w:p>
-    <w:p>
-      <w:r>
-        <w:rPr>
           <w:b w:val="0"/>
           <w:i w:val="0"/>
           <w:sz w:val="21"/>
         </w:rPr>
-        <w:t>Landlord is / is not (circle one) an affiliate of Tenant or Tenant’s owners. If affiliated, describe the relationship: ________________.</w:t>
+        <w:t>Landlord (Burns Commercial Properties) is an independent, third-party lessor and is NOT an affiliate of Tenant or Tenant’s owners; this is an arm’s-length lease at market rent. [Confirm and initial.]</w:t>
       </w:r>
     </w:p>
     <w:p/>
@@ -744,7 +713,7 @@
           <w:i w:val="0"/>
           <w:sz w:val="21"/>
         </w:rPr>
-        <w:t>LANDLORD</w:t>
+        <w:t>LANDLORD  —  Burns Commercial Properties</w:t>
       </w:r>
     </w:p>
     <w:p>
@@ -775,16 +744,6 @@
           <w:sz w:val="20"/>
         </w:rPr>
         <w:t xml:space="preserve">   Title: ________________</w:t>
-      </w:r>
-    </w:p>
-    <w:p>
-      <w:r>
-        <w:rPr>
-          <w:b w:val="0"/>
-          <w:i w:val="0"/>
-          <w:sz w:val="20"/>
-        </w:rPr>
-        <w:t xml:space="preserve">   Entity (if any): ________________</w:t>
       </w:r>
     </w:p>
     <w:p/>
@@ -825,7 +784,7 @@
           <w:i w:val="0"/>
           <w:sz w:val="20"/>
         </w:rPr>
-        <w:t xml:space="preserve">   Title: Manager  [signs on behalf of Tenant after the change-of-ownership closing]</w:t>
+        <w:t xml:space="preserve">   Title: Manager</w:t>
       </w:r>
     </w:p>
     <w:p>
@@ -846,7 +805,7 @@
           <w:color w:val="606060"/>
           <w:sz w:val="17"/>
         </w:rPr>
-        <w:t>Exhibits to attach if applicable: Exhibit A – Landlord’s Work / Premises condition; Exhibit B – site or floor plan; Exhibit C – Rules and Regulations. Before signing, confirm: Landlord legal name and address; Premises square footage and suite; Commencement date and exact term dates; security deposit amount; and whether Base Rent is fixed or escalates. Note on signing authority: the Tenant signature block names Geoff Schackmann as Manager, which is correct once the Hickory acquisition closes; before closing, the current Hickory manager would sign, or the lease should be dated to be effective at/after closing.</w:t>
+        <w:t>Remaining fill-ins: Landlord mailing address; Landlord signatory name/title; number and length of renewal options (for the SBA term requirement). Signing-authority note: the Tenant signs as Hickory Hospice, LLC by its Manager. Because the Hickory change-of-ownership is scheduled to close after the June 1, 2026 commencement, confirm who holds Manager authority on the signing date — pre-closing, the current Hickory manager signs (or Tyler Hospice Hold LLC signs/guarantees the lease); post-closing, Geoff Schackmann signs. Align the signature with the actual closing sequence.</w:t>
       </w:r>
     </w:p>
     <w:sectPr>

</xml_diff>